<commit_message>
latest resume and intro to tensorflow webcam hand-detection
</commit_message>
<xml_diff>
--- a/public/Resume.docx
+++ b/public/Resume.docx
@@ -45,7 +45,7 @@
           <w:rFonts w:ascii="Roboto" w:cs="Roboto" w:eastAsia="Roboto" w:hAnsi="Roboto"/>
           <w:rtl w:val="0"/>
         </w:rPr>
-        <w:t xml:space="preserve">Looking for a wholesome company.  As your next hire my productivity will be unmatched.</w:t>
+        <w:t xml:space="preserve">As your next hire my productivity will be unmatched.</w:t>
       </w:r>
     </w:p>
     <w:p>
@@ -892,7 +892,7 @@
           <w:rFonts w:ascii="Roboto Light" w:cs="Roboto Light" w:eastAsia="Roboto Light" w:hAnsi="Roboto Light"/>
           <w:rtl w:val="0"/>
         </w:rPr>
-        <w:t xml:space="preserve">• Developer Operations </w:t>
+        <w:t xml:space="preserve">• Developer Operations</w:t>
       </w:r>
     </w:p>
     <w:p>
@@ -924,7 +924,7 @@
           <w:rFonts w:ascii="Roboto Light" w:cs="Roboto Light" w:eastAsia="Roboto Light" w:hAnsi="Roboto Light"/>
           <w:rtl w:val="0"/>
         </w:rPr>
-        <w:t xml:space="preserve">• Expert Level Mastery of Microsoft Excel</w:t>
+        <w:t xml:space="preserve">• Mastery of Microsoft Excel</w:t>
       </w:r>
     </w:p>
     <w:p>
@@ -1422,7 +1422,7 @@
           <w:rFonts w:ascii="Roboto Light" w:cs="Roboto Light" w:eastAsia="Roboto Light" w:hAnsi="Roboto Light"/>
           <w:rtl w:val="0"/>
         </w:rPr>
-        <w:t xml:space="preserve">• Contributed to the management, renovation, and sale of over 20 condos in Florida, which each profited ~$100K.</w:t>
+        <w:t xml:space="preserve">• Recipient of Multiple 4 &amp; 5-Digit Bonuses</w:t>
       </w:r>
     </w:p>
     <w:p>
@@ -1437,36 +1437,6 @@
           <w:rFonts w:ascii="Roboto Light" w:cs="Roboto Light" w:eastAsia="Roboto Light" w:hAnsi="Roboto Light"/>
           <w:rtl w:val="0"/>
         </w:rPr>
-        <w:t xml:space="preserve">• Made over $100,000 on first single family home sale.</w:t>
-      </w:r>
-    </w:p>
-    <w:p>
-      <w:pPr>
-        <w:ind w:left="0" w:firstLine="0"/>
-        <w:rPr>
-          <w:rFonts w:ascii="Roboto Light" w:cs="Roboto Light" w:eastAsia="Roboto Light" w:hAnsi="Roboto Light"/>
-        </w:rPr>
-      </w:pPr>
-      <w:r>
-        <w:rPr>
-          <w:rFonts w:ascii="Roboto Light" w:cs="Roboto Light" w:eastAsia="Roboto Light" w:hAnsi="Roboto Light"/>
-          <w:rtl w:val="0"/>
-        </w:rPr>
-        <w:t xml:space="preserve">• Recipient of Multiple 4 &amp; 5-Digit Bonuses</w:t>
-      </w:r>
-    </w:p>
-    <w:p>
-      <w:pPr>
-        <w:ind w:left="0" w:firstLine="0"/>
-        <w:rPr>
-          <w:rFonts w:ascii="Roboto Light" w:cs="Roboto Light" w:eastAsia="Roboto Light" w:hAnsi="Roboto Light"/>
-        </w:rPr>
-      </w:pPr>
-      <w:r>
-        <w:rPr>
-          <w:rFonts w:ascii="Roboto Light" w:cs="Roboto Light" w:eastAsia="Roboto Light" w:hAnsi="Roboto Light"/>
-          <w:rtl w:val="0"/>
-        </w:rPr>
         <w:t xml:space="preserve">• Proud Husband and Father </w:t>
       </w:r>
       <w:r>
@@ -1476,41 +1446,6 @@
           <w:rtl w:val="0"/>
         </w:rPr>
         <w:t xml:space="preserve">*Greatest Achievement*</w:t>
-      </w:r>
-      <w:r>
-        <w:rPr>
-          <w:rtl w:val="0"/>
-        </w:rPr>
-      </w:r>
-    </w:p>
-    <w:p>
-      <w:pPr>
-        <w:ind w:left="0" w:firstLine="0"/>
-        <w:rPr>
-          <w:rFonts w:ascii="Roboto Light" w:cs="Roboto Light" w:eastAsia="Roboto Light" w:hAnsi="Roboto Light"/>
-        </w:rPr>
-      </w:pPr>
-      <w:r>
-        <w:rPr>
-          <w:rFonts w:ascii="Roboto Light" w:cs="Roboto Light" w:eastAsia="Roboto Light" w:hAnsi="Roboto Light"/>
-          <w:rtl w:val="0"/>
-        </w:rPr>
-        <w:t xml:space="preserve">• Promoted to the Rank of E-4 (Specialist) before technically allowed</w:t>
-      </w:r>
-    </w:p>
-    <w:p>
-      <w:pPr>
-        <w:ind w:left="0" w:firstLine="0"/>
-        <w:rPr>
-          <w:rFonts w:ascii="Roboto Light" w:cs="Roboto Light" w:eastAsia="Roboto Light" w:hAnsi="Roboto Light"/>
-        </w:rPr>
-      </w:pPr>
-      <w:r>
-        <w:rPr>
-          <w:rFonts w:ascii="Roboto Light" w:cs="Roboto Light" w:eastAsia="Roboto Light" w:hAnsi="Roboto Light"/>
-          <w:rtl w:val="0"/>
-        </w:rPr>
-        <w:t xml:space="preserve">• Eagle Scout</w:t>
       </w:r>
       <w:r>
         <w:rPr>

</xml_diff>